<commit_message>
feat(backup): preserve original media in portable memory archives
</commit_message>
<xml_diff>
--- a/frontend/doc/共同记忆项目说明_2026-10-13.docx
+++ b/frontend/doc/共同记忆项目说明_2026-10-13.docx
@@ -1381,7 +1381,7 @@
       <w:spacing w:after="140" w:line="288" w:lineRule="auto"/>
     </w:pPr>
     <w:rPr>
-      <w:rFonts w:ascii="Arial" w:hAnsi="Arial" w:eastAsia="Songti SC"/>
+      <w:rFonts w:ascii="Noto Sans CJK SC" w:hAnsi="Noto Sans CJK SC" w:eastAsia="Noto Sans CJK SC"/>
       <w:color w:val="000000"/>
       <w:sz w:val="22"/>
     </w:rPr>
@@ -1445,7 +1445,7 @@
       <w:outlineLvl w:val="0"/>
     </w:pPr>
     <w:rPr>
-      <w:rFonts w:asciiTheme="majorHAnsi" w:eastAsiaTheme="majorEastAsia" w:hAnsiTheme="majorHAnsi" w:cstheme="majorBidi" w:ascii="Arial" w:hAnsi="Arial" w:eastAsia="Songti SC"/>
+      <w:rFonts w:asciiTheme="majorHAnsi" w:eastAsiaTheme="majorEastAsia" w:hAnsiTheme="majorHAnsi" w:cstheme="majorBidi" w:ascii="Noto Sans CJK SC" w:hAnsi="Noto Sans CJK SC" w:eastAsia="Noto Sans CJK SC"/>
       <w:b/>
       <w:bCs/>
       <w:color w:val="000000"/>
@@ -1469,7 +1469,7 @@
       <w:outlineLvl w:val="1"/>
     </w:pPr>
     <w:rPr>
-      <w:rFonts w:asciiTheme="majorHAnsi" w:eastAsiaTheme="majorEastAsia" w:hAnsiTheme="majorHAnsi" w:cstheme="majorBidi" w:ascii="Arial" w:hAnsi="Arial" w:eastAsia="Songti SC"/>
+      <w:rFonts w:asciiTheme="majorHAnsi" w:eastAsiaTheme="majorEastAsia" w:hAnsiTheme="majorHAnsi" w:cstheme="majorBidi" w:ascii="Noto Sans CJK SC" w:hAnsi="Noto Sans CJK SC" w:eastAsia="Noto Sans CJK SC"/>
       <w:b/>
       <w:bCs/>
       <w:color w:val="000000"/>
@@ -1734,7 +1734,7 @@
       <w:contextualSpacing/>
     </w:pPr>
     <w:rPr>
-      <w:rFonts w:asciiTheme="majorHAnsi" w:eastAsiaTheme="majorEastAsia" w:hAnsiTheme="majorHAnsi" w:cstheme="majorBidi" w:ascii="Arial" w:hAnsi="Arial" w:eastAsia="Songti SC"/>
+      <w:rFonts w:asciiTheme="majorHAnsi" w:eastAsiaTheme="majorEastAsia" w:hAnsiTheme="majorHAnsi" w:cstheme="majorBidi" w:ascii="Noto Sans CJK SC" w:hAnsi="Noto Sans CJK SC" w:eastAsia="Noto Sans CJK SC"/>
       <w:color w:val="000000"/>
       <w:spacing w:val="5"/>
       <w:kern w:val="28"/>
@@ -1772,7 +1772,7 @@
       <w:spacing w:after="140" w:line="288" w:lineRule="auto"/>
     </w:pPr>
     <w:rPr>
-      <w:rFonts w:asciiTheme="majorHAnsi" w:eastAsiaTheme="majorEastAsia" w:hAnsiTheme="majorHAnsi" w:cstheme="majorBidi" w:ascii="Arial" w:hAnsi="Arial" w:eastAsia="Songti SC"/>
+      <w:rFonts w:asciiTheme="majorHAnsi" w:eastAsiaTheme="majorEastAsia" w:hAnsiTheme="majorHAnsi" w:cstheme="majorBidi" w:ascii="Noto Sans CJK SC" w:hAnsi="Noto Sans CJK SC" w:eastAsia="Noto Sans CJK SC"/>
       <w:i/>
       <w:iCs/>
       <w:color w:val="000000"/>

</xml_diff>